<commit_message>
Added some minor stuff to report
</commit_message>
<xml_diff>
--- a/Report/ProjectEngReport.docx
+++ b/Report/ProjectEngReport.docx
@@ -3750,37 +3750,6 @@
             </w:rPr>
             <w:t xml:space="preserve"> </w:t>
           </w:r>
-          <w:sdt>
-            <w:sdtPr>
-              <w:rPr>
-                <w:rFonts w:ascii="Cambria" w:eastAsiaTheme="majorEastAsia" w:hAnsi="Cambria" w:cs="Times New Roman"/>
-                <w:b/>
-                <w:bCs/>
-                <w:color w:val="262626" w:themeColor="text1" w:themeTint="D9"/>
-                <w:sz w:val="36"/>
-                <w:szCs w:val="36"/>
-              </w:rPr>
-              <w:alias w:val="Title"/>
-              <w:tag w:val=""/>
-              <w:id w:val="-1077587500"/>
-              <w:dataBinding w:prefixMappings="xmlns:ns0='http://purl.org/dc/elements/1.1/' xmlns:ns1='http://schemas.openxmlformats.org/package/2006/metadata/core-properties' " w:xpath="/ns1:coreProperties[1]/ns0:title[1]" w:storeItemID="{6C3C8BC8-F283-45AE-878A-BAB7291924A1}"/>
-              <w:text/>
-            </w:sdtPr>
-            <w:sdtEndPr/>
-            <w:sdtContent>
-              <w:r>
-                <w:rPr>
-                  <w:rFonts w:ascii="Cambria" w:eastAsiaTheme="majorEastAsia" w:hAnsi="Cambria" w:cs="Times New Roman"/>
-                  <w:b/>
-                  <w:bCs/>
-                  <w:color w:val="262626" w:themeColor="text1" w:themeTint="D9"/>
-                  <w:sz w:val="36"/>
-                  <w:szCs w:val="36"/>
-                </w:rPr>
-                <w:t>Project-Grow</w:t>
-              </w:r>
-            </w:sdtContent>
-          </w:sdt>
         </w:p>
         <w:p>
           <w:pPr>
@@ -3877,15 +3846,6 @@
                                     <w:sz w:val="36"/>
                                     <w:szCs w:val="36"/>
                                   </w:rPr>
-                                  <w:t xml:space="preserve">Automatic </w:t>
-                                </w:r>
-                                <w:r>
-                                  <w:rPr>
-                                    <w:rFonts w:ascii="Cambria" w:eastAsiaTheme="majorEastAsia" w:hAnsi="Cambria" w:cs="Times New Roman"/>
-                                    <w:color w:val="262626" w:themeColor="text1" w:themeTint="D9"/>
-                                    <w:sz w:val="36"/>
-                                    <w:szCs w:val="36"/>
-                                  </w:rPr>
                                   <w:t>Environment Monitoring</w:t>
                                 </w:r>
                               </w:p>
@@ -3907,29 +3867,8 @@
                                     <w:sz w:val="36"/>
                                     <w:szCs w:val="36"/>
                                   </w:rPr>
-                                  <w:t>For G</w:t>
+                                  <w:t>System</w:t>
                                 </w:r>
-                                <w:r>
-                                  <w:rPr>
-                                    <w:rFonts w:ascii="Cambria" w:eastAsiaTheme="majorEastAsia" w:hAnsi="Cambria" w:cs="Times New Roman"/>
-                                    <w:color w:val="262626" w:themeColor="text1" w:themeTint="D9"/>
-                                    <w:sz w:val="36"/>
-                                    <w:szCs w:val="36"/>
-                                  </w:rPr>
-                                  <w:t>row Area</w:t>
-                                </w:r>
-                              </w:p>
-                              <w:p>
-                                <w:pPr>
-                                  <w:pStyle w:val="NoSpacing"/>
-                                  <w:jc w:val="center"/>
-                                  <w:rPr>
-                                    <w:rFonts w:ascii="Cambria" w:eastAsiaTheme="majorEastAsia" w:hAnsi="Cambria" w:cs="Times New Roman"/>
-                                    <w:color w:val="262626" w:themeColor="text1" w:themeTint="D9"/>
-                                    <w:sz w:val="36"/>
-                                    <w:szCs w:val="36"/>
-                                  </w:rPr>
-                                </w:pPr>
                               </w:p>
                             </w:txbxContent>
                           </wps:txbx>
@@ -3990,15 +3929,6 @@
                               <w:sz w:val="36"/>
                               <w:szCs w:val="36"/>
                             </w:rPr>
-                            <w:t xml:space="preserve">Automatic </w:t>
-                          </w:r>
-                          <w:r>
-                            <w:rPr>
-                              <w:rFonts w:ascii="Cambria" w:eastAsiaTheme="majorEastAsia" w:hAnsi="Cambria" w:cs="Times New Roman"/>
-                              <w:color w:val="262626" w:themeColor="text1" w:themeTint="D9"/>
-                              <w:sz w:val="36"/>
-                              <w:szCs w:val="36"/>
-                            </w:rPr>
                             <w:t>Environment Monitoring</w:t>
                           </w:r>
                         </w:p>
@@ -4020,29 +3950,8 @@
                               <w:sz w:val="36"/>
                               <w:szCs w:val="36"/>
                             </w:rPr>
-                            <w:t>For G</w:t>
+                            <w:t>System</w:t>
                           </w:r>
-                          <w:r>
-                            <w:rPr>
-                              <w:rFonts w:ascii="Cambria" w:eastAsiaTheme="majorEastAsia" w:hAnsi="Cambria" w:cs="Times New Roman"/>
-                              <w:color w:val="262626" w:themeColor="text1" w:themeTint="D9"/>
-                              <w:sz w:val="36"/>
-                              <w:szCs w:val="36"/>
-                            </w:rPr>
-                            <w:t>row Area</w:t>
-                          </w:r>
-                        </w:p>
-                        <w:p>
-                          <w:pPr>
-                            <w:pStyle w:val="NoSpacing"/>
-                            <w:jc w:val="center"/>
-                            <w:rPr>
-                              <w:rFonts w:ascii="Cambria" w:eastAsiaTheme="majorEastAsia" w:hAnsi="Cambria" w:cs="Times New Roman"/>
-                              <w:color w:val="262626" w:themeColor="text1" w:themeTint="D9"/>
-                              <w:sz w:val="36"/>
-                              <w:szCs w:val="36"/>
-                            </w:rPr>
-                          </w:pPr>
                         </w:p>
                       </w:txbxContent>
                     </v:textbox>
@@ -6455,7 +6364,13 @@
       </w:r>
       <w:proofErr w:type="spellEnd"/>
       <w:r>
-        <w:t xml:space="preserve"> is used to store the data sent from ESP32 and hosted on AWS servers. </w:t>
+        <w:t xml:space="preserve"> is used to store the data sent from ESP32 and hosted on AWS</w:t>
+      </w:r>
+      <w:r>
+        <w:t xml:space="preserve"> ec2</w:t>
+      </w:r>
+      <w:r>
+        <w:t xml:space="preserve"> servers. </w:t>
       </w:r>
     </w:p>
     <w:p>
@@ -6731,25 +6646,49 @@
         <w:rPr>
           <w:rFonts w:cstheme="minorHAnsi"/>
         </w:rPr>
-        <w:t>Growing food</w:t>
+        <w:t xml:space="preserve">Inspiration for </w:t>
       </w:r>
       <w:r>
         <w:rPr>
           <w:rFonts w:cstheme="minorHAnsi"/>
         </w:rPr>
+        <w:t xml:space="preserve">this </w:t>
+      </w:r>
+      <w:r>
+        <w:rPr>
+          <w:rFonts w:cstheme="minorHAnsi"/>
+        </w:rPr>
+        <w:t xml:space="preserve">project came </w:t>
+      </w:r>
+      <w:r>
+        <w:rPr>
+          <w:rFonts w:cstheme="minorHAnsi"/>
+        </w:rPr>
+        <w:t>as result of the increase of g</w:t>
+      </w:r>
+      <w:r>
+        <w:rPr>
+          <w:rFonts w:cstheme="minorHAnsi"/>
+        </w:rPr>
+        <w:t>rowing food</w:t>
+      </w:r>
+      <w:r>
+        <w:rPr>
+          <w:rFonts w:cstheme="minorHAnsi"/>
+        </w:rPr>
         <w:t xml:space="preserve"> at home</w:t>
       </w:r>
       <w:r>
         <w:rPr>
           <w:rFonts w:cstheme="minorHAnsi"/>
         </w:rPr>
-        <w:t xml:space="preserve"> has</w:t>
+        <w:t xml:space="preserve"> </w:t>
       </w:r>
       <w:r>
         <w:rPr>
           <w:rFonts w:cstheme="minorHAnsi"/>
         </w:rPr>
-        <w:t xml:space="preserve"> become increasingly popular in recent years. There was a huge growth around lockdown and people have got more conscious about sustainability. Also</w:t>
+        <w:t>in recent years. There was a huge growth around lockdown and people have got more conscious about sustainability. Also</w:t>
       </w:r>
       <w:r>
         <w:rPr>
@@ -6791,12 +6730,36 @@
         <w:rPr>
           <w:rFonts w:cstheme="minorHAnsi"/>
         </w:rPr>
-        <w:t xml:space="preserve"> our climate restricts certain crops and time of year when you can grow.</w:t>
+        <w:t xml:space="preserve"> our climate restricts certain crops and time of year when </w:t>
       </w:r>
       <w:r>
         <w:rPr>
           <w:rFonts w:cstheme="minorHAnsi"/>
         </w:rPr>
+        <w:t>it is possible to</w:t>
+      </w:r>
+      <w:r>
+        <w:rPr>
+          <w:rFonts w:cstheme="minorHAnsi"/>
+        </w:rPr>
+        <w:t xml:space="preserve"> grow</w:t>
+      </w:r>
+      <w:r>
+        <w:rPr>
+          <w:rFonts w:cstheme="minorHAnsi"/>
+        </w:rPr>
+        <w:t xml:space="preserve"> crops</w:t>
+      </w:r>
+      <w:r>
+        <w:rPr>
+          <w:rFonts w:cstheme="minorHAnsi"/>
+        </w:rPr>
+        <w:t>.</w:t>
+      </w:r>
+      <w:r>
+        <w:rPr>
+          <w:rFonts w:cstheme="minorHAnsi"/>
+        </w:rPr>
         <w:t xml:space="preserve"> </w:t>
       </w:r>
     </w:p>
@@ -6834,13 +6797,13 @@
         <w:rPr>
           <w:rFonts w:cstheme="minorHAnsi"/>
         </w:rPr>
-        <w:t xml:space="preserve"> resulting in less taste and less nutritio</w:t>
+        <w:t xml:space="preserve"> resulting in less taste and less nutriti</w:t>
       </w:r>
       <w:r>
         <w:rPr>
           <w:rFonts w:cstheme="minorHAnsi"/>
         </w:rPr>
-        <w:t>n</w:t>
+        <w:t>ous produce</w:t>
       </w:r>
       <w:r>
         <w:rPr>
@@ -6848,13 +6811,6 @@
         </w:rPr>
         <w:t xml:space="preserve">. </w:t>
       </w:r>
-    </w:p>
-    <w:p>
-      <w:pPr>
-        <w:rPr>
-          <w:rFonts w:cstheme="minorHAnsi"/>
-        </w:rPr>
-      </w:pPr>
     </w:p>
     <w:p>
       <w:pPr>
@@ -6877,12 +6833,6 @@
         </w:rPr>
         <w:t xml:space="preserve">. Not only must </w:t>
       </w:r>
-      <w:r>
-        <w:rPr>
-          <w:rFonts w:cstheme="minorHAnsi"/>
-        </w:rPr>
-        <w:tab/>
-      </w:r>
     </w:p>
     <w:p>
       <w:pPr>
@@ -6893,6 +6843,12 @@
           <w:rFonts w:cstheme="minorHAnsi"/>
         </w:rPr>
       </w:pPr>
+      <w:r>
+        <w:rPr>
+          <w:rFonts w:cstheme="minorHAnsi"/>
+        </w:rPr>
+        <w:t>https://scholar.google.com/scholar?q=environment+monitoring+project+site:.edu&amp;hl=en&amp;as_sdt=0&amp;as_vis=1&amp;oi=scholart</w:t>
+      </w:r>
     </w:p>
     <w:p>
       <w:pPr>
@@ -6907,21 +6863,13 @@
         <w:rPr>
           <w:rFonts w:cstheme="minorHAnsi"/>
         </w:rPr>
-        <w:t xml:space="preserve">Why </w:t>
-      </w:r>
-      <w:proofErr w:type="spellStart"/>
+        <w:t xml:space="preserve">Due to weather and light restrictions it is for hard for horticultural industry to monitor and control the various in a grow area.   </w:t>
+      </w:r>
       <w:r>
         <w:rPr>
           <w:rFonts w:cstheme="minorHAnsi"/>
         </w:rPr>
-        <w:t>im</w:t>
-      </w:r>
-      <w:proofErr w:type="spellEnd"/>
-      <w:r>
-        <w:rPr>
-          <w:rFonts w:cstheme="minorHAnsi"/>
-        </w:rPr>
-        <w:t xml:space="preserve"> interested in it?</w:t>
+        <w:tab/>
       </w:r>
     </w:p>
     <w:p>
@@ -6940,23 +6888,240 @@
           <w:tab w:val="left" w:pos="7515"/>
         </w:tabs>
         <w:rPr>
-          <w:lang w:val="en-IE"/>
-        </w:rPr>
-      </w:pPr>
-      <w:r>
-        <w:rPr>
           <w:rFonts w:cstheme="minorHAnsi"/>
         </w:rPr>
+      </w:pPr>
+      <w:r>
+        <w:rPr>
+          <w:rFonts w:cstheme="minorHAnsi"/>
+        </w:rPr>
+        <w:t xml:space="preserve">Why </w:t>
+      </w:r>
+      <w:proofErr w:type="spellStart"/>
+      <w:r>
+        <w:rPr>
+          <w:rFonts w:cstheme="minorHAnsi"/>
+        </w:rPr>
+        <w:t>im</w:t>
+      </w:r>
+      <w:proofErr w:type="spellEnd"/>
+      <w:r>
+        <w:rPr>
+          <w:rFonts w:cstheme="minorHAnsi"/>
+        </w:rPr>
+        <w:t xml:space="preserve"> interested in it?</w:t>
+      </w:r>
+    </w:p>
+    <w:p>
+      <w:pPr>
+        <w:tabs>
+          <w:tab w:val="left" w:pos="7515"/>
+        </w:tabs>
+        <w:rPr>
+          <w:rFonts w:cstheme="minorHAnsi"/>
+        </w:rPr>
+      </w:pPr>
+    </w:p>
+    <w:p>
+      <w:pPr>
+        <w:tabs>
+          <w:tab w:val="left" w:pos="7515"/>
+        </w:tabs>
+        <w:rPr>
+          <w:lang w:val="en-IE"/>
+        </w:rPr>
+      </w:pPr>
+      <w:r>
+        <w:rPr>
+          <w:rFonts w:cstheme="minorHAnsi"/>
+        </w:rPr>
         <w:t xml:space="preserve">Altium </w:t>
       </w:r>
     </w:p>
     <w:p>
       <w:pPr>
         <w:rPr>
-          <w:rFonts w:asciiTheme="majorHAnsi" w:eastAsiaTheme="majorEastAsia" w:hAnsiTheme="majorHAnsi" w:cstheme="majorBidi"/>
-          <w:color w:val="2E74B5" w:themeColor="accent1" w:themeShade="BF"/>
-          <w:sz w:val="32"/>
-          <w:szCs w:val="32"/>
+          <w:lang w:val="en-IE"/>
+        </w:rPr>
+      </w:pPr>
+      <w:proofErr w:type="gramStart"/>
+      <w:r>
+        <w:rPr>
+          <w:lang w:val="en-IE"/>
+        </w:rPr>
+        <w:t>overall</w:t>
+      </w:r>
+      <w:proofErr w:type="gramEnd"/>
+      <w:r>
+        <w:rPr>
+          <w:lang w:val="en-IE"/>
+        </w:rPr>
+        <w:t xml:space="preserve"> really enjoyed my project especially website server part and embedded part. I </w:t>
+      </w:r>
+      <w:r>
+        <w:rPr>
+          <w:lang w:val="en-IE"/>
+        </w:rPr>
+        <w:t>enjoyed</w:t>
+      </w:r>
+      <w:r>
+        <w:rPr>
+          <w:lang w:val="en-IE"/>
+        </w:rPr>
+        <w:t xml:space="preserve"> attending to my plants also but I </w:t>
+      </w:r>
+      <w:r>
+        <w:rPr>
+          <w:lang w:val="en-IE"/>
+        </w:rPr>
+        <w:t>believe</w:t>
+      </w:r>
+      <w:r>
+        <w:rPr>
+          <w:lang w:val="en-IE"/>
+        </w:rPr>
+        <w:t xml:space="preserve"> would have enjoyed more if it </w:t>
+      </w:r>
+      <w:proofErr w:type="gramStart"/>
+      <w:r>
+        <w:rPr>
+          <w:lang w:val="en-IE"/>
+        </w:rPr>
+        <w:t>was..</w:t>
+      </w:r>
+      <w:proofErr w:type="gramEnd"/>
+    </w:p>
+    <w:p>
+      <w:pPr>
+        <w:rPr>
+          <w:lang w:val="en-IE"/>
+        </w:rPr>
+      </w:pPr>
+      <w:r>
+        <w:rPr>
+          <w:lang w:val="en-IE"/>
+        </w:rPr>
+        <w:t>Nice break away from technical stuff</w:t>
+      </w:r>
+      <w:r>
+        <w:rPr>
+          <w:lang w:val="en-IE"/>
+        </w:rPr>
+        <w:t xml:space="preserve"> working in grow tent</w:t>
+      </w:r>
+      <w:r>
+        <w:rPr>
+          <w:lang w:val="en-IE"/>
+        </w:rPr>
+        <w:t xml:space="preserve"> although</w:t>
+      </w:r>
+    </w:p>
+    <w:p>
+      <w:pPr>
+        <w:rPr>
+          <w:lang w:val="en-IE"/>
+        </w:rPr>
+      </w:pPr>
+      <w:r>
+        <w:rPr>
+          <w:lang w:val="en-IE"/>
+        </w:rPr>
+        <w:t xml:space="preserve">Code for sensors was easy enough </w:t>
+      </w:r>
+      <w:proofErr w:type="spellStart"/>
+      <w:r>
+        <w:rPr>
+          <w:lang w:val="en-IE"/>
+        </w:rPr>
+        <w:t>o</w:t>
+      </w:r>
+      <w:proofErr w:type="spellEnd"/>
+      <w:r>
+        <w:rPr>
+          <w:lang w:val="en-IE"/>
+        </w:rPr>
+        <w:t xml:space="preserve"> implement just matter of importing </w:t>
+      </w:r>
+      <w:r>
+        <w:rPr>
+          <w:lang w:val="en-IE"/>
+        </w:rPr>
+        <w:t>libraries</w:t>
+      </w:r>
+      <w:r>
+        <w:rPr>
+          <w:lang w:val="en-IE"/>
+        </w:rPr>
+        <w:t xml:space="preserve">. But when </w:t>
+      </w:r>
+      <w:proofErr w:type="spellStart"/>
+      <w:r>
+        <w:rPr>
+          <w:lang w:val="en-IE"/>
+        </w:rPr>
+        <w:t>freertos</w:t>
+      </w:r>
+      <w:proofErr w:type="spellEnd"/>
+      <w:r>
+        <w:rPr>
+          <w:lang w:val="en-IE"/>
+        </w:rPr>
+        <w:t xml:space="preserve"> was introduced ran into some problems like with the dht22.</w:t>
+      </w:r>
+    </w:p>
+    <w:p>
+      <w:pPr>
+        <w:rPr>
+          <w:lang w:val="en-IE"/>
+        </w:rPr>
+      </w:pPr>
+    </w:p>
+    <w:p>
+      <w:pPr>
+        <w:rPr>
+          <w:lang w:val="en-IE"/>
+        </w:rPr>
+      </w:pPr>
+      <w:proofErr w:type="gramStart"/>
+      <w:r>
+        <w:rPr>
+          <w:lang w:val="en-IE"/>
+        </w:rPr>
+        <w:lastRenderedPageBreak/>
+        <w:t>Also</w:t>
+      </w:r>
+      <w:proofErr w:type="gramEnd"/>
+      <w:r>
+        <w:rPr>
+          <w:lang w:val="en-IE"/>
+        </w:rPr>
+        <w:t xml:space="preserve"> we were using </w:t>
+      </w:r>
+      <w:proofErr w:type="spellStart"/>
+      <w:r>
+        <w:rPr>
+          <w:lang w:val="en-IE"/>
+        </w:rPr>
+        <w:t>freertos</w:t>
+      </w:r>
+      <w:proofErr w:type="spellEnd"/>
+      <w:r>
+        <w:rPr>
+          <w:lang w:val="en-IE"/>
+        </w:rPr>
+        <w:t xml:space="preserve"> as an embedded system so wanted to incorporate to help get better understanding </w:t>
+      </w:r>
+    </w:p>
+    <w:p>
+      <w:pPr>
+        <w:rPr>
+          <w:lang w:val="en-IE"/>
+        </w:rPr>
+      </w:pPr>
+    </w:p>
+    <w:p>
+      <w:pPr>
+        <w:rPr>
           <w:lang w:val="en-IE"/>
         </w:rPr>
       </w:pPr>
@@ -6969,6 +7134,13 @@
     </w:p>
     <w:p>
       <w:pPr>
+        <w:rPr>
+          <w:lang w:val="en-IE"/>
+        </w:rPr>
+      </w:pPr>
+    </w:p>
+    <w:p>
+      <w:pPr>
         <w:pStyle w:val="Heading1"/>
         <w:rPr>
           <w:lang w:val="en-IE"/>
@@ -6979,7 +7151,6 @@
         <w:rPr>
           <w:lang w:val="en-IE"/>
         </w:rPr>
-        <w:lastRenderedPageBreak/>
         <w:t>Background</w:t>
       </w:r>
       <w:bookmarkEnd w:id="3"/>
@@ -11950,7 +12121,144 @@
         <w:rPr>
           <w:lang w:val="en-IE"/>
         </w:rPr>
-        <w:t>used MS Word’s ‘Insert Citation’</w:t>
+        <w:t xml:space="preserve">used MS </w:t>
+      </w:r>
+    </w:p>
+    <w:p>
+      <w:pPr>
+        <w:spacing w:line="259" w:lineRule="auto"/>
+        <w:rPr>
+          <w:lang w:val="en-IE"/>
+        </w:rPr>
+      </w:pPr>
+      <w:r>
+        <w:rPr>
+          <w:lang w:val="en-IE"/>
+        </w:rPr>
+        <w:br w:type="page"/>
+      </w:r>
+    </w:p>
+    <w:p>
+      <w:pPr>
+        <w:rPr>
+          <w:lang w:val="en-IE"/>
+        </w:rPr>
+      </w:pPr>
+      <w:r>
+        <w:rPr>
+          <w:lang w:val="en-IE"/>
+        </w:rPr>
+        <w:lastRenderedPageBreak/>
+        <w:t>Code Overview</w:t>
+      </w:r>
+    </w:p>
+    <w:p>
+      <w:pPr>
+        <w:rPr>
+          <w:lang w:val="en-IE"/>
+        </w:rPr>
+      </w:pPr>
+    </w:p>
+    <w:p>
+      <w:pPr>
+        <w:rPr>
+          <w:lang w:val="en-IE"/>
+        </w:rPr>
+      </w:pPr>
+      <w:r>
+        <w:rPr>
+          <w:lang w:val="en-IE"/>
+        </w:rPr>
+        <w:t xml:space="preserve">Program starts and takes readings and saved to </w:t>
+      </w:r>
+      <w:proofErr w:type="spellStart"/>
+      <w:r>
+        <w:rPr>
+          <w:lang w:val="en-IE"/>
+        </w:rPr>
+        <w:t>sd</w:t>
+      </w:r>
+      <w:proofErr w:type="spellEnd"/>
+      <w:r>
+        <w:rPr>
+          <w:lang w:val="en-IE"/>
+        </w:rPr>
+        <w:t xml:space="preserve"> </w:t>
+      </w:r>
+    </w:p>
+    <w:p>
+      <w:pPr>
+        <w:rPr>
+          <w:lang w:val="en-IE"/>
+        </w:rPr>
+      </w:pPr>
+      <w:r>
+        <w:rPr>
+          <w:lang w:val="en-IE"/>
+        </w:rPr>
+        <w:t xml:space="preserve">For css811 and bh1750 need to use a semaphore to share resources because they are </w:t>
+      </w:r>
+      <w:proofErr w:type="spellStart"/>
+      <w:r>
+        <w:rPr>
+          <w:lang w:val="en-IE"/>
+        </w:rPr>
+        <w:t>usong</w:t>
+      </w:r>
+      <w:proofErr w:type="spellEnd"/>
+      <w:r>
+        <w:rPr>
+          <w:lang w:val="en-IE"/>
+        </w:rPr>
+        <w:t xml:space="preserve"> I2C bus and I was getting wrong readings</w:t>
+      </w:r>
+    </w:p>
+    <w:p>
+      <w:pPr>
+        <w:rPr>
+          <w:lang w:val="en-IE"/>
+        </w:rPr>
+      </w:pPr>
+      <w:r>
+        <w:rPr>
+          <w:lang w:val="en-IE"/>
+        </w:rPr>
+        <w:t>We have software timer that increments variable by one second and sets a bit in the event group that allow Time Out task to run and putting it to sleep.</w:t>
+      </w:r>
+    </w:p>
+    <w:p>
+      <w:pPr>
+        <w:rPr>
+          <w:lang w:val="en-IE"/>
+        </w:rPr>
+      </w:pPr>
+    </w:p>
+    <w:p>
+      <w:pPr>
+        <w:spacing w:line="259" w:lineRule="auto"/>
+        <w:rPr>
+          <w:lang w:val="en-IE"/>
+        </w:rPr>
+      </w:pPr>
+      <w:r>
+        <w:rPr>
+          <w:lang w:val="en-IE"/>
+        </w:rPr>
+        <w:br w:type="page"/>
+      </w:r>
+    </w:p>
+    <w:p>
+      <w:pPr>
+        <w:rPr>
+          <w:lang w:val="en-IE"/>
+        </w:rPr>
+      </w:pPr>
+      <w:r>
+        <w:rPr>
+          <w:lang w:val="en-IE"/>
+        </w:rPr>
+        <w:lastRenderedPageBreak/>
+        <w:t>Word’s ‘Insert Citation’</w:t>
       </w:r>
       <w:r>
         <w:rPr>
@@ -12832,80 +13140,86 @@
         <w:rPr>
           <w:lang w:val="en-IE"/>
         </w:rPr>
+        <w:t>I</w:t>
+      </w:r>
+      <w:r>
+        <w:rPr>
+          <w:lang w:val="en-IE"/>
+        </w:rPr>
+        <w:t>n d</w:t>
+      </w:r>
+      <w:r>
+        <w:rPr>
+          <w:lang w:val="en-IE"/>
+        </w:rPr>
+        <w:t>escrib</w:t>
+      </w:r>
+      <w:r>
+        <w:rPr>
+          <w:lang w:val="en-IE"/>
+        </w:rPr>
+        <w:t>ing</w:t>
+      </w:r>
+      <w:r>
+        <w:rPr>
+          <w:lang w:val="en-IE"/>
+        </w:rPr>
+        <w:t xml:space="preserve"> software, </w:t>
+      </w:r>
+      <w:r>
+        <w:rPr>
+          <w:lang w:val="en-IE"/>
+        </w:rPr>
+        <w:t xml:space="preserve">you need diagrams </w:t>
+      </w:r>
+      <w:r>
+        <w:rPr>
+          <w:lang w:val="en-IE"/>
+        </w:rPr>
+        <w:t xml:space="preserve">and/or summaries of software design &amp; layout. It </w:t>
+      </w:r>
+      <w:r>
+        <w:rPr>
+          <w:lang w:val="en-IE"/>
+        </w:rPr>
+        <w:t>is not suffi</w:t>
+      </w:r>
+      <w:r>
+        <w:rPr>
+          <w:lang w:val="en-IE"/>
+        </w:rPr>
+        <w:t>c</w:t>
+      </w:r>
+      <w:r>
+        <w:rPr>
+          <w:lang w:val="en-IE"/>
+        </w:rPr>
+        <w:t>i</w:t>
+      </w:r>
+      <w:r>
+        <w:rPr>
+          <w:lang w:val="en-IE"/>
+        </w:rPr>
+        <w:t>ent to just paste some code</w:t>
+      </w:r>
+      <w:r>
+        <w:rPr>
+          <w:lang w:val="en-IE"/>
+        </w:rPr>
+        <w:t>. Y</w:t>
+      </w:r>
+      <w:r>
+        <w:rPr>
+          <w:lang w:val="en-IE"/>
+        </w:rPr>
+        <w:t xml:space="preserve">ou should describe what your code is designed to do, in </w:t>
+      </w:r>
+      <w:r>
+        <w:rPr>
+          <w:lang w:val="en-IE"/>
+        </w:rPr>
         <w:lastRenderedPageBreak/>
-        <w:t>I</w:t>
-      </w:r>
-      <w:r>
-        <w:rPr>
-          <w:lang w:val="en-IE"/>
-        </w:rPr>
-        <w:t>n d</w:t>
-      </w:r>
-      <w:r>
-        <w:rPr>
-          <w:lang w:val="en-IE"/>
-        </w:rPr>
-        <w:t>escrib</w:t>
-      </w:r>
-      <w:r>
-        <w:rPr>
-          <w:lang w:val="en-IE"/>
-        </w:rPr>
-        <w:t>ing</w:t>
-      </w:r>
-      <w:r>
-        <w:rPr>
-          <w:lang w:val="en-IE"/>
-        </w:rPr>
-        <w:t xml:space="preserve"> software, </w:t>
-      </w:r>
-      <w:r>
-        <w:rPr>
-          <w:lang w:val="en-IE"/>
-        </w:rPr>
-        <w:t xml:space="preserve">you need diagrams </w:t>
-      </w:r>
-      <w:r>
-        <w:rPr>
-          <w:lang w:val="en-IE"/>
-        </w:rPr>
-        <w:t xml:space="preserve">and/or summaries of software design &amp; layout. It </w:t>
-      </w:r>
-      <w:r>
-        <w:rPr>
-          <w:lang w:val="en-IE"/>
-        </w:rPr>
-        <w:t>is not suffi</w:t>
-      </w:r>
-      <w:r>
-        <w:rPr>
-          <w:lang w:val="en-IE"/>
-        </w:rPr>
-        <w:t>c</w:t>
-      </w:r>
-      <w:r>
-        <w:rPr>
-          <w:lang w:val="en-IE"/>
-        </w:rPr>
-        <w:t>i</w:t>
-      </w:r>
-      <w:r>
-        <w:rPr>
-          <w:lang w:val="en-IE"/>
-        </w:rPr>
-        <w:t>ent to just paste some code</w:t>
-      </w:r>
-      <w:r>
-        <w:rPr>
-          <w:lang w:val="en-IE"/>
-        </w:rPr>
-        <w:t>. Y</w:t>
-      </w:r>
-      <w:r>
-        <w:rPr>
-          <w:lang w:val="en-IE"/>
-        </w:rPr>
-        <w:t xml:space="preserve">ou should describe what your code is designed to do, in English. </w:t>
+        <w:t xml:space="preserve">English. </w:t>
       </w:r>
       <w:r>
         <w:rPr>
@@ -15952,46 +16266,46 @@
       </w:rPr>
     </w:lvl>
   </w:abstractNum>
-  <w:num w:numId="1">
+  <w:num w:numId="1" w16cid:durableId="2119594105">
     <w:abstractNumId w:val="7"/>
   </w:num>
-  <w:num w:numId="2">
+  <w:num w:numId="2" w16cid:durableId="2063946389">
     <w:abstractNumId w:val="4"/>
   </w:num>
-  <w:num w:numId="3">
+  <w:num w:numId="3" w16cid:durableId="953290431">
     <w:abstractNumId w:val="13"/>
   </w:num>
-  <w:num w:numId="4">
+  <w:num w:numId="4" w16cid:durableId="1045061715">
     <w:abstractNumId w:val="8"/>
   </w:num>
-  <w:num w:numId="5">
+  <w:num w:numId="5" w16cid:durableId="683366175">
     <w:abstractNumId w:val="2"/>
   </w:num>
-  <w:num w:numId="6">
+  <w:num w:numId="6" w16cid:durableId="238755944">
     <w:abstractNumId w:val="5"/>
   </w:num>
-  <w:num w:numId="7">
+  <w:num w:numId="7" w16cid:durableId="557860187">
     <w:abstractNumId w:val="6"/>
   </w:num>
-  <w:num w:numId="8">
+  <w:num w:numId="8" w16cid:durableId="52437300">
     <w:abstractNumId w:val="1"/>
   </w:num>
-  <w:num w:numId="9">
+  <w:num w:numId="9" w16cid:durableId="20130333">
     <w:abstractNumId w:val="0"/>
   </w:num>
-  <w:num w:numId="10">
+  <w:num w:numId="10" w16cid:durableId="1792744122">
     <w:abstractNumId w:val="11"/>
   </w:num>
-  <w:num w:numId="11">
+  <w:num w:numId="11" w16cid:durableId="281423073">
     <w:abstractNumId w:val="10"/>
   </w:num>
-  <w:num w:numId="12">
+  <w:num w:numId="12" w16cid:durableId="753821062">
     <w:abstractNumId w:val="3"/>
   </w:num>
-  <w:num w:numId="13">
+  <w:num w:numId="13" w16cid:durableId="538661103">
     <w:abstractNumId w:val="9"/>
   </w:num>
-  <w:num w:numId="14">
+  <w:num w:numId="14" w16cid:durableId="1072242581">
     <w:abstractNumId w:val="12"/>
   </w:num>
 </w:numbering>
@@ -17165,7 +17479,6 @@
     <w:pitch w:val="default"/>
   </w:font>
   <w:font w:name="Franklin Gothic Book">
-    <w:panose1 w:val="020B0503020102020204"/>
     <w:charset w:val="00"/>
     <w:family w:val="swiss"/>
     <w:pitch w:val="variable"/>
@@ -17199,15 +17512,20 @@
     <w:rsidRoot w:val="00A64543"/>
     <w:rsid w:val="00131D58"/>
     <w:rsid w:val="00135822"/>
+    <w:rsid w:val="001C754F"/>
     <w:rsid w:val="001F6978"/>
     <w:rsid w:val="00220658"/>
     <w:rsid w:val="003D6BDE"/>
+    <w:rsid w:val="004939AF"/>
+    <w:rsid w:val="005A4FA6"/>
     <w:rsid w:val="005F293A"/>
     <w:rsid w:val="006C0768"/>
+    <w:rsid w:val="009D48BC"/>
     <w:rsid w:val="00A64543"/>
     <w:rsid w:val="00AF0019"/>
     <w:rsid w:val="00B570E8"/>
     <w:rsid w:val="00C50F49"/>
+    <w:rsid w:val="00C963B4"/>
     <w:rsid w:val="00F77D4F"/>
   </w:rsids>
   <m:mathPr>

</xml_diff>